<commit_message>
feat: implementar logica para seleccionar plantilla de IVA (INVERSION_5) y soporte para placehoder IVA_SI_NO
</commit_message>
<xml_diff>
--- a/doc/DESIGANCION_SUPERVISOR_SIN_APOYO.docx
+++ b/doc/DESIGANCION_SUPERVISOR_SIN_APOYO.docx
@@ -1249,7 +1249,7 @@
           <w:sz w:val="24"/>
           <w:szCs w:val="24"/>
         </w:rPr>
-        <w:t>Expedir mensualmente el/los Informe(s) de Supervisión que detalle el cumplimiento de las obligaciones a cargo del Contratista. En el evento en que se observe algún tipo de inconsistencia sobre los aportes de seguridad social, el supervisor deberá adelantar las acciones a que haya lugar, de conformidad con la normativa vigente.</w:t>
+        <w:t>Expedir mensualmente el/los Informe(s) de Supervisión que detalle el cumplimiento de las obligaciones a cargo del ${CARGO_REVISO}. En el evento en que se observe algún tipo de inconsistencia sobre los aportes de seguridad social, el supervisor deberá adelantar las acciones a que haya lugar, de conformidad con la normativa vigente.</w:t>
       </w:r>
     </w:p>
     <w:p>
@@ -4364,7 +4364,7 @@
           <w:sz w:val="16"/>
           <w:szCs w:val="16"/>
         </w:rPr>
-        <w:t>Elaboró: Jetsabel Mendez Iles – Contratista</w:t>
+        <w:t>Elaboró: Jetsabel Mendez Iles – ${CARGO_REVISO}</w:t>
       </w:r>
     </w:p>
     <w:p>
@@ -4390,7 +4390,7 @@
           <w:sz w:val="16"/>
           <w:szCs w:val="16"/>
         </w:rPr>
-        <w:t xml:space="preserve">Johana Fuquene </w:t>
+        <w:t xml:space="preserve">${NOMBRE_REVISO} </w:t>
       </w:r>
       <w:r>
         <w:rPr>
@@ -4399,7 +4399,7 @@
           <w:sz w:val="16"/>
           <w:szCs w:val="16"/>
         </w:rPr>
-        <w:t xml:space="preserve"> – Abogada Contratista</w:t>
+        <w:t xml:space="preserve"> – ${CARGO_REVISO}</w:t>
       </w:r>
     </w:p>
     <w:p>

</xml_diff>